<commit_message>
Update PLAN.md and tech spec with Phase 7 post-launch requests
Documents the four requests handled since the v9.0 hardening pass:
restored sign-in/verify illustrations and removed demo credentials,
real Google Workspace/Microsoft 365 SSO replacing the old config-only
stub (including the SSO/password-policy lockout bug found and fixed
during the review), the notification bell's unread count badge, and
the full-codebase review itself. Corrects PLAN.md's now-stale "SSO is
configuration-only" claims from Phase 1. Tech spec bumped to v9.1 with
a new Section 10.3; verified via LibreOffice PDF conversion before
and after, on a scratch copy first.

Co-Authored-By: Claude Sonnet 5 <noreply@anthropic.com>
</commit_message>
<xml_diff>
--- a/HRIS_Roadmap_and_Technical_Specification.docx
+++ b/HRIS_Roadmap_and_Technical_Specification.docx
@@ -61,7 +61,7 @@
         <w:spacing w:after="60"/>
       </w:pPr>
       <w:r>
-        <w:t>Last revised: 28 September 2026 (v9.0 — the build described by this specification is now complete: every phase in Section 7's roadmap, Domains A through F, is implemented, tested, and running. This revision adds Section 10, documenting that completion and a subsequent hardening pass — four functional gaps closed and a security audit's findings fixed — that followed it. v8.2's e-signature legal-framework note, v8.1's Leave Management policy defaults, v7's two-stage approval confirmation, and v6's technology-stack/UI-UX-adoption changes all carry forward unchanged)</w:t>
+        <w:t>Last revised: 28 September 2026 (v9.1 — adds Section 10.3, four small post-launch requests handled after the v9.0 hardening pass: the sign-in/verify screens' illustrations were restored to match the original UI/UX artifact, Google Workspace and Microsoft 365 single sign-on replaced the old SSO configuration stub, the notification bell switched from an unread dot to an unread count to match the companion SI PIM application, and a full-codebase review of all of the above found and fixed one lockout risk. v9.0's build-completion note, v8.2's e-signature legal-framework note, v8.1's Leave Management policy defaults, v7's two-stage approval confirmation, and v6's technology-stack/UI-UX-adoption changes all carry forward unchanged)</w:t>
       </w:r>
     </w:p>
     <w:p>
@@ -22079,6 +22079,87 @@
     <w:p>
       <w:r>
         <w:t>Two items initially left as documented trade-offs were closed in a follow-up pass, on request: Buzz/Post photos now go through the same private-disk-plus-authenticated-controller path as the other affected collections described in 10.2.2, gated on the feed's own existing visibility rule (Section F1); and the public, unauthenticated careers/job-application upload (Section D1) is now rate-limited to 10 applications per hour, keyed by IP.</w:t>
+      </w:r>
+    </w:p>
+    <w:p>
+      <w:pPr>
+        <w:pStyle w:val="Heading2"/>
+      </w:pPr>
+      <w:r>
+        <w:t>10.3 Post-launch requests</w:t>
+      </w:r>
+    </w:p>
+    <w:p>
+      <w:r>
+        <w:t>Four small, discrete requests handled after the v9.0 hardening pass above, each verified and shipped separately rather than batched.</w:t>
+      </w:r>
+    </w:p>
+    <w:p>
+      <w:pPr>
+        <w:pStyle w:val="Heading3"/>
+      </w:pPr>
+      <w:r>
+        <w:t>10.3.1 Sign-in/verify illustrations restored; demo credentials removed</w:t>
+      </w:r>
+    </w:p>
+    <w:p>
+      <w:r>
+        <w:t>The sign-in and 2FA-verify screens had drifted from the original UI/UX artifact (Main.dc.html, TwoFactor.dc.html): both illustration slots held a simplified placeholder icon instead of the artifact's org-chart-with-pulse and laptop/phone/shield graphics. The exact SVG markup was restored from the artifact files. Separately, the login form's demo-account credentials list — an onboarding/development convenience with no place on a screen anyone could reach — was removed.</w:t>
+      </w:r>
+    </w:p>
+    <w:p>
+      <w:pPr>
+        <w:pStyle w:val="Heading3"/>
+      </w:pPr>
+      <w:r>
+        <w:t>10.3.2 Single sign-on: Google Workspace and Microsoft 365</w:t>
+      </w:r>
+    </w:p>
+    <w:p>
+      <w:r>
+        <w:t>Section A3's SSO button had been a configuration-only stub since Phase 1 (see Section 10.2.1's superseded note). It now performs real OAuth 2.0/OIDC sign-in via Laravel Socialite, exactly the technology named in Section 3's stack (Google as a Socialite core driver; Microsoft 365/Entra ID via the socialiteproviders/microsoft package). This delivers the OpenID Connect half of the A3 heading for these two named identity providers; the LDAP/AD half of that heading remains unimplemented.</w:t>
+      </w:r>
+    </w:p>
+    <w:p>
+      <w:r>
+        <w:t>Sign-in does not auto-provision accounts: a successful identity-provider login is matched against an existing User by email, and a non-match is rejected the same way a wrong password is, consistent with this system's “accounts are created by HR during onboarding” model. A successful SSO login also satisfies the system's own two-factor gate, on the basis that the identity provider is itself the strong-authentication factor. Client credentials are encrypted and admin-configurable from the Settings screen — the same storage pattern already used for SMTP credentials — rather than requiring a server-side .env edit and redeploy to enable, disable, or rotate a provider.</w:t>
+      </w:r>
+    </w:p>
+    <w:p>
+      <w:r>
+        <w:rPr>
+          <w:b/>
+        </w:rPr>
+        <w:t xml:space="preserve">Lockout risk found and fixed in the same pass: </w:t>
+      </w:r>
+      <w:r>
+        <w:t>the existing “enforce password policy on login” gate (Section A1) forces a “type your current password” change whenever the organization's password policy has tightened since an account was created. That gate is meaningless — and a genuine lockout — for a user who signs in only via SSO and may never have known or used a local password. The SSO sign-in path now flags its session accordingly, and the policy gate skips its forced redirect for that session.</w:t>
+      </w:r>
+    </w:p>
+    <w:p>
+      <w:pPr>
+        <w:pStyle w:val="Heading3"/>
+      </w:pPr>
+      <w:r>
+        <w:t>10.3.3 Notification bell: unread count badge</w:t>
+      </w:r>
+    </w:p>
+    <w:p>
+      <w:r>
+        <w:t>Requested so this system's notification bell (Section A7) presents the same way as the equivalent bell in the companion SI PIM application: the unread indicator changed from a plain dot to a count badge (capped at “9+”), the bell's accessible label states the unread count, and the panel only offers “Mark all read”/“Clear all” when there is something to act on.</w:t>
+      </w:r>
+    </w:p>
+    <w:p>
+      <w:pPr>
+        <w:pStyle w:val="Heading3"/>
+      </w:pPr>
+      <w:r>
+        <w:t>10.3.4 Full-codebase review</w:t>
+      </w:r>
+    </w:p>
+    <w:p>
+      <w:r>
+        <w:t>Requested directly, following the three changes above: every file touched since the v9.0 hardening pass was re-reviewed for regressions and security issues, rather than repeating that full audit from scratch. This is what surfaced the SSO/password-policy lockout risk in Section 10.3.2. A dependency vulnerability scan of the two packages this phase added found no advisories, and the full automated test suite — extended with dedicated coverage for the SSO sign-in flow and the notification badge — passed.</w:t>
       </w:r>
     </w:p>
     <w:sectPr>

</xml_diff>

<commit_message>
Fix Buzz photo uploads, mobile nav/layout bugs, and add shared file-input
- Buzz: raise PHP upload_max_filesize/post_max_size via public/.htaccess and
  the photos.* rule to 10MB; photos >= 2MB were rejected by PHP before Laravel
  validation, surfacing as "failed to upload". Feed now auto-updates (wire:poll.15s).
- Mobile: contextual bottom tab bar per menu segment, accordion "More" sheet with
  expand/collapse all, grid min-width fix for horizontal overflow, toolbar wrapping.
- Sidebar scroll position now restores after Alpine reveals content.
- Directory: expanding one card no longer stretches the whole row.
- New <x-file-input> component gives every file upload a distinct primary button;
  applied across all 13 upload sites.
- Includes accompanying pulse survey, onboarding template, sub-unit and
  my-requests work already in the tree.

Co-Authored-By: Claude Sonnet 5.5 <noreply@anthropic.com>
</commit_message>
<xml_diff>
--- a/HRIS_Roadmap_and_Technical_Specification.docx
+++ b/HRIS_Roadmap_and_Technical_Specification.docx
@@ -61,7 +61,7 @@
         <w:spacing w:after="60"/>
       </w:pPr>
       <w:r>
-        <w:t>Last revised: 28 September 2026 (v9.1 — adds Section 10.3, four small post-launch requests handled after the v9.0 hardening pass: the sign-in/verify screens' illustrations were restored to match the original UI/UX artifact, Google Workspace and Microsoft 365 single sign-on replaced the old SSO configuration stub, the notification bell switched from an unread dot to an unread count to match the companion SI PIM application, and a full-codebase review of all of the above found and fixed one lockout risk. v9.0's build-completion note, v8.2's e-signature legal-framework note, v8.1's Leave Management policy defaults, v7's two-stage approval confirmation, and v6's technology-stack/UI-UX-adoption changes all carry forward unchanged)</w:t>
+        <w:t>Last revised: 1 October 2026 (v9.2 — adds Section 10.4, a broad HRIS backlog review: self-service/workspace fixes, employee-record refinements (Department Code, Qualifications and Career Development added to self-service, Preferred Name removed), editable onboarding/offboarding templates with task duration, leave-type visibility rules, a navigation and page-text-size restructuring (superseding 3.4’s nav description) plus two mobile-layout defects fixed, chart-based reporting across Leave/Timesheet/Attendance/Employee reports and the dashboard, a Pulse Survey question-bank redesign extending F8, and Admin Settings reorganized into tabs. v9.1’s post-launch requests, v9.0’s build-completion note, v8.2’s e-signature legal-framework note, v8.1’s Leave Management policy defaults, v7’s two-stage approval confirmation, and v6’s technology-stack/UI-UX-adoption changes all carry forward unchanged)</w:t>
       </w:r>
     </w:p>
     <w:p>
@@ -22160,6 +22160,123 @@
     <w:p>
       <w:r>
         <w:t>Requested directly, following the three changes above: every file touched since the v9.0 hardening pass was re-reviewed for regressions and security issues, rather than repeating that full audit from scratch. This is what surfaced the SSO/password-policy lockout risk in Section 10.3.2. A dependency vulnerability scan of the two packages this phase added found no advisories, and the full automated test suite — extended with dedicated coverage for the SSO sign-in flow and the notification badge — passed.</w:t>
+      </w:r>
+    </w:p>
+    <w:p>
+      <w:pPr>
+        <w:pStyle w:val="Heading2"/>
+      </w:pPr>
+      <w:r>
+        <w:t>10.4 HRIS backlog review (October 2026)</w:t>
+      </w:r>
+    </w:p>
+    <w:p>
+      <w:r>
+        <w:t>A 19-item backlog of bug reports and feature requests from Systems Intelligenz HRA was worked through in full. Items with an unambiguous correct behavior were implemented directly; three items needing an explicit policy decision (a department short-code format, onboarding/offboarding task duration, and leave-type visibility) were confirmed with SI before building; and three larger items (chart-based reporting, navigation restructuring, and Pulse Survey question flexibility) were written up as a proposal for SI’s review before any code was written, then built once approved, with further refinements SI requested after seeing the result.</w:t>
+      </w:r>
+    </w:p>
+    <w:p>
+      <w:pPr>
+        <w:pStyle w:val="Heading3"/>
+      </w:pPr>
+      <w:r>
+        <w:t>10.4.1 Workspace and self-service fixes</w:t>
+      </w:r>
+    </w:p>
+    <w:p>
+      <w:r>
+        <w:t>Profile photo upload (B2) silently failed to persist in the view after a successful save, caused by Eloquent’s relation cache not refreshing after the underlying media record was written; fixed, with file-type/size/resolution requirements now shown inline. The duplicate “My Profile” sidebar entry was removed (the avatar-menu entry already reaches the same screen). The sidebar’s scroll position now persists across the full-page navigations this application deliberately uses (Section 3.5’s frontend note), instead of resetting to the top on every click. The Home dashboard’s “My Open Requests” tile now opens a new detail screen listing every leave request and expense claim the employee has submitted with its full approval-trail status, rather than being a static count with nowhere to click through to. The Corporate Directory (F3) now shows each employee’s uploaded photo, drops the Employee ID column, and adds who they report to.</w:t>
+      </w:r>
+    </w:p>
+    <w:p>
+      <w:pPr>
+        <w:pStyle w:val="Heading3"/>
+      </w:pPr>
+      <w:r>
+        <w:t>10.4.2 Employee record refinements (extends B1, B2, B3)</w:t>
+      </w:r>
+    </w:p>
+    <w:p>
+      <w:r>
+        <w:t>Preferred Name, a field on the Employee Master Record (B2) that had never been surfaced in any screen since it was added, was removed outright rather than wired up to a use it never had. B1’s Organization &amp; Master Data screen (its “Sub-units” tab, renamed “Departments” throughout its UI to match how SI refers to them; the underlying data model is unchanged) gained a Department Code on each department: exactly three uppercase letters, enforced unique, entered manually, for use as a short form in reports (e.g., “Sales &amp; Marketing” becomes SMA). The Gender field on the Personal tab was narrowed to Male/Female. B2’s self-service employee view, renamed “My Info” in the interface (it was “My Profile”; its editable section is labelled “Biodata”), was expanded to include the Qualifications sub-record (education, skills, languages, licenses, memberships, work experience) and a new “Career Development” tab (development plans and training records) alongside the existing Personal and Contact tabs. Onboarding/offboarding task assignment itself (B3) remains an HR-initiated action only, deliberately not added to self-service, so an employee cannot assign onboarding/offboarding tasks to themselves.</w:t>
+      </w:r>
+    </w:p>
+    <w:p>
+      <w:pPr>
+        <w:pStyle w:val="Heading3"/>
+      </w:pPr>
+      <w:r>
+        <w:t>10.4.3 Onboarding/Offboarding templates (extends B3)</w:t>
+      </w:r>
+    </w:p>
+    <w:p>
+      <w:r>
+        <w:t>Templates, previously delete-and-recreate only, are now editable in place. Each template’s task items gained a duration (expressed in hours or days) as a field distinct from B3’s existing due-date offset — one answers “how long this takes,” the other “when it is due” — with the template’s cumulative total time now shown alongside its name.</w:t>
+      </w:r>
+    </w:p>
+    <w:p>
+      <w:pPr>
+        <w:pStyle w:val="Heading3"/>
+      </w:pPr>
+      <w:r>
+        <w:t>10.4.4 Leave type visibility (extends C1)</w:t>
+      </w:r>
+    </w:p>
+    <w:p>
+      <w:r>
+        <w:t>Apply Leave’s leave-type list now hides a type only when the requesting employee has zero entitlement to it and that type is flagged as excluded from reporting if unentitled (an existing C1 configuration flag); a leave type SI has deliberately made available to everyone without a pre-assigned entitlement (e.g., unpaid leave) is never hidden by this rule. Re-validated server-side on submission as well as in the dropdown, since the selected type is client-supplied.</w:t>
+      </w:r>
+    </w:p>
+    <w:p>
+      <w:pPr>
+        <w:pStyle w:val="Heading3"/>
+      </w:pPr>
+      <w:r>
+        <w:t>10.4.5 Navigation and layout (supersedes 3.4’s navigation description; extends A5)</w:t>
+      </w:r>
+    </w:p>
+    <w:p>
+      <w:r>
+        <w:t>3.4’s three-group sidebar (Workspace / My Team / Company) no longer reflects the number of screens the system has grown to since Phase 0 — the Admin group alone had grown to eighteen screens in one flat list. The sidebar is now eight groups: Home (pinned above every group, never itself collapsed), Workspace, Company, My Info, Socials, My Team (unchanged), and three replacing the old single Admin group — HR Admin (the day-to-day HR configuration screens), Reports (Leave/Timesheet/Attendance/Employee reports, previously scattered one per module with no common home), and Admin (system/security-level screens only). Page body text — sub-headings and in-page copy, not headings, buttons, or the navigation itself — was increased via a five-step type scale added to the design system’s tokens (3.4), consolidating what had become nine slightly different hand-picked sizes. Two defects in the mobile (narrower than 1024px) layout, present since the responsive shell was first built, were found and fixed in the same pass: the top bar’s avatar/notification cluster rendered at the left edge instead of the right (a single-flex-child side effect of hiding the search box at that width), and most of the navigation was simply unreachable below the sidebar’s cutoff width — a “more” bottom-sheet had been styled but never connected to a control, so only four of the sidebar’s several dozen destinations had any mobile entry point at all. The bottom tab bar now includes a “More” action opening that sheet, grouped the same way as the sidebar.</w:t>
+      </w:r>
+    </w:p>
+    <w:p>
+      <w:pPr>
+        <w:pStyle w:val="Heading3"/>
+      </w:pPr>
+      <w:r>
+        <w:t>10.4.6 Chart-based reporting (extends C1, C2, C3, B2, F2)</w:t>
+      </w:r>
+    </w:p>
+    <w:p>
+      <w:r>
+        <w:t>SI’s reports — Leave (C1), Timesheet and Attendance (C2/C3), and the Employee Report Builder (B2) — gained a chart alongside their existing table, never replacing it, since the table remains the detailed record HR audits against: a bar chart of leave days used by type, a bar chart of timesheet hours by the report’s own grouping, a line chart of daily attendance-hours trend, and a doughnut chart of headcount composition for the employee report builder’s current filtered result. F2’s dashboard headcount-by-department/location tiles, previously a hand-rolled bar-meter standing in for a chart, were replaced with the same real chart component.</w:t>
+      </w:r>
+    </w:p>
+    <w:p>
+      <w:pPr>
+        <w:pStyle w:val="Heading3"/>
+      </w:pPr>
+      <w:r>
+        <w:t>10.4.7 Pulse Survey question banks (extends F8)</w:t>
+      </w:r>
+    </w:p>
+    <w:p>
+      <w:r>
+        <w:t>F8’s original design fixed every template to exactly one scale question plus one optional free-text question, by design, to keep completion rates high. That constraint is preserved in spirit but no longer in mechanism: a template is now a question bank of any number of scale or free-text questions, and a run selects a subset of up to five when it launches — short by a configurable cap, not short because only two questions exist. Results now report per question (average score, response distribution, and eNPS for a scale question; a filtered comment list for a free-text question), still gated on the same minimum-response anonymization threshold as before, since that threshold protects anonymity based on how many people responded at all, not on any one question. Launching a run is now a capability independent of authoring the question bank: HR Officer, who previously had no Pulse Survey access beyond responding as an employee, can now launch a run from an HR-Admin-authored template and view its results, while creating or editing templates stays HR Admin/Admin only. A pre-existing F2 dashboard tile summarizing eNPS was adjusted in the same pass, since eNPS now belongs to a specific question rather than to a run as a whole.</w:t>
+      </w:r>
+    </w:p>
+    <w:p>
+      <w:pPr>
+        <w:pStyle w:val="Heading3"/>
+      </w:pPr>
+      <w:r>
+        <w:t>10.4.8 Admin Settings reorganized into tabs (extends A5)</w:t>
+      </w:r>
+    </w:p>
+    <w:p>
+      <w:r>
+        <w:t>A5’s single-page Settings screen had grown to fifteen independent configuration sections in one long scroll. It is now five tabs grouping settings an administrator would reasonably change together: Security (two-factor policy, password policy, data retention, idle session timeout), Branding &amp; Organization (branding, Employee ID format, organization profile), Integrations (SMTP, Google Workspace SSO, Microsoft 365 SSO), System (health check visibility, optional profile tabs, dashboard scope, Help &amp; Support), and Modules (Time &amp; Attendance, Expense Claims).</w:t>
       </w:r>
     </w:p>
     <w:sectPr>

</xml_diff>